<commit_message>
Replace T|F notation with plain language in two-stage coding prose
</commit_message>
<xml_diff>
--- a/thesis/Thesis_Proposal_Instagram_MH_v11.docx
+++ b/thesis/Thesis_Proposal_Instagram_MH_v11.docx
@@ -1680,7 +1680,7 @@
           <w:b w:val="0"/>
           <w:sz w:val="22"/>
         </w:rPr>
-        <w:t>Caption coding follows a two-stage procedure rather than an exhaustive keyword inventory. Stage 1 (Identify) marks whether hope construction and empowerment language are each present (T) or absent (F), using the illustrative signals in Appendix A. Stage 2 (Sort) assigns the dominant code from that presence pattern: T|F yields HOPE, F|T yields EMPOWERMENT, T|T requires dominance adjudication by main-clause or final position and by speech-act force ("Things can or will get better" versus "You can or should act"), and F|F is coded as blended or indeterminate. When Stage 1 is T|T and the two adjudication checks disagree or neither orientation is clearly stronger, the caption is also coded as blended or indeterminate. Feature tallies are still recorded for distributional description. Each caption receives only one dominant code. This function-driven procedure is consistent with PDA's emphasis on discursive purpose over keyword frequency and is suited to short-form digital texts where meaning is densely packed within limited word counts.</w:t>
+        <w:t>Caption coding follows a two-stage procedure rather than an exhaustive keyword inventory. Stage 1 (Identify) marks whether hope construction and empowerment language are each present or absent, using the illustrative signals in Appendix A. Stage 2 (Sort) assigns the dominant code from that pattern. If only hope is present, the caption is coded HOPE. If only empowerment is present, the caption is coded EMPOWERMENT. If both are present, dominance is adjudicated by main-clause or final position and by speech-act force ("Things can or will get better" versus "You can or should act"). If neither is present, or if both are present and the adjudication checks disagree or neither orientation is clearly stronger, the caption is coded as blended or indeterminate. Feature tallies are still recorded for distributional description. Each caption receives only one dominant code. This function-driven procedure is consistent with PDA's emphasis on discursive purpose over keyword frequency and is suited to short-form digital texts where meaning is densely packed within limited word counts.</w:t>
       </w:r>
     </w:p>
     <w:p>
@@ -2556,7 +2556,7 @@
           <w:szCs w:val="22"/>
           <w:rtl w:val="0"/>
         </w:rPr>
-        <w:t>Function-Driven Coding. A qualitative analytical approach that categorizes linguistic features based on their discursive purpose in context, not mechanical keyword matching. Caption coding uses a two-stage Identify-and-Sort procedure (see Appendix A). Stage 1 records presence or absence of each orientation. Stage 2 assigns the dominant code, with dominance under dual presence adjudicated by main-clause or final position and by speech-act force. Cases that remain unclear are coded as blended or indeterminate and reported separately.</w:t>
+        <w:t>Function-Driven Coding. A qualitative analytical approach that categorizes linguistic features based on their discursive purpose in context, not mechanical keyword matching. Caption coding uses a two-stage Identify-and-Sort procedure (see Appendix A). Stage 1 records whether each orientation is present or absent. Stage 2 assigns the dominant code. When both orientations are present, dominance is adjudicated by main-clause or final position and by speech-act force. Cases that remain unclear are coded as blended or indeterminate and reported separately.</w:t>
       </w:r>
       <w:r>
         <w:rPr>
@@ -2990,7 +2990,7 @@
           <w:szCs w:val="22"/>
           <w:rtl w:val="0"/>
         </w:rPr>
-        <w:t>3. Caption Coding. Each caption is read holistically. Coding follows the two-stage Identify-and-Sort procedure in Appendix A. Stage 1 marks hope construction and empowerment language as present (T) or absent (F) from illustrative signals. Stage 2 assigns HOPE, EMPOWERMENT, or blended/indeterminate according to the presence pattern and, when both are present, according to main-clause or final position and speech-act force. Feature tallies are retained for distributional description.</w:t>
+        <w:t>3. Caption Coding. Each caption is read holistically. Coding follows the two-stage Identify-and-Sort procedure in Appendix A. Stage 1 marks hope construction and empowerment language as present or absent from illustrative signals. Stage 2 assigns HOPE if only hope is present, EMPOWERMENT if only empowerment is present, and blended or indeterminate if neither is present. When both are present, dominance is decided by main-clause or final position and by speech-act force. Feature tallies are retained for distributional description.</w:t>
       </w:r>
       <w:r>
         <w:rPr>
@@ -4094,10 +4094,9 @@
             <w:r>
               <w:rPr>
                 <w:rFonts w:ascii="Times New Roman" w:hAnsi="Times New Roman"/>
-                <w:b w:val="0"/>
                 <w:sz w:val="18"/>
               </w:rPr>
-              <w:t>Stage 1: mark H as T if hope signals are present. Stage 2: code HOPE when the pattern is T|F, or when T|T and hope wins dominance (main clause or final position and speech act "Things can or will get better"). Record feature types and counts. Example: "Healing is not linear, but you will get there. Recovery takes time, and every small step forward matters." (forward-looking modality: will; recovery nouns: healing, recovery; temporal: takes time)</w:t>
+              <w:t>Stage 1: mark hope construction as present if hope signals appear. Stage 2: code HOPE when only hope is present, or when both orientations are present and hope wins dominance (main clause or final position and speech act "Things can or will get better"). Record feature types and counts. Example: "Healing is not linear, but you will get there. Recovery takes time, and every small step forward matters." (forward-looking modality: will; recovery nouns: healing, recovery; temporal: takes time)</w:t>
             </w:r>
           </w:p>
         </w:tc>
@@ -4199,10 +4198,9 @@
             <w:r>
               <w:rPr>
                 <w:rFonts w:ascii="Times New Roman" w:hAnsi="Times New Roman"/>
-                <w:b w:val="0"/>
                 <w:sz w:val="18"/>
               </w:rPr>
-              <w:t>Stage 1: mark E as T if empowerment signals are present. Stage 2: code EMPOWERMENT when the pattern is F|T, or when T|T and empowerment wins dominance (main clause or final position and speech act "You can or should act"). Record feature types and counts. Example: "Set boundaries that protect your peace. You can decide what serves your mental health and what doesn't." (directive: set; agency: you can decide; self-care: boundaries; autonomy: what serves your mental health)</w:t>
+              <w:t>Stage 1: mark empowerment language as present if empowerment signals appear. Stage 2: code EMPOWERMENT when only empowerment is present, or when both orientations are present and empowerment wins dominance (main clause or final position and speech act "You can or should act"). Record feature types and counts. Example: "Set boundaries that protect your peace. You can decide what serves your mental health and what doesn't." (directive: set; agency: you can decide; self-care: boundaries; autonomy: what serves your mental health)</w:t>
             </w:r>
           </w:p>
         </w:tc>
@@ -4215,7 +4213,7 @@
           <w:b w:val="0"/>
           <w:sz w:val="20"/>
         </w:rPr>
-        <w:t>Decision procedure (two-stage Identify and Sort). The markers in Table A1 are illustrative signals, not an exhaustive inventory. Coding proceeds in two stages. Stage 1 — Identify. For each caption, mark hope construction (H) and empowerment language (E) as present (T) or absent (F) on the basis of the illustrative signals. Stage 2 — Sort. Assign the dominant code from the presence pattern: T|F is coded HOPE, F|T is coded EMPOWERMENT, F|F is coded blended or indeterminate, and T|T requires dominance adjudication. Under T|T, ask which orientation occupies the main clause(s) or the final prominent position and which speech act carries the main force of the text — "Things can or will get better" (HOPE) or "You can or should act" (EMPOWERMENT). The orientation that wins both checks, or clearly wins one while the other is only peripheral, becomes the dominant code. If the checks disagree or neither orientation is clearly stronger, code as blended or indeterminate. Blended cases are logged separately and excluded from the main HOPE versus EMPOWERMENT distribution.</w:t>
+        <w:t>Decision procedure (two-stage Identify and Sort). The markers in Table A1 are illustrative signals, not an exhaustive inventory. Coding proceeds in two stages. Stage 1 — Identify. For each caption, mark hope construction and empowerment language as present or absent on the basis of the illustrative signals. Stage 2 — Sort. If only hope construction is present, code HOPE. If only empowerment language is present, code EMPOWERMENT. If neither is present, code blended or indeterminate. If both are present, adjudicate dominance: which orientation occupies the main clause(s) or the final prominent position, and which speech act carries the main force of the text — "Things can or will get better" (HOPE) or "You can or should act" (EMPOWERMENT). The orientation that wins both checks, or clearly wins one while the other is only peripheral, becomes the dominant code. If the checks disagree or neither orientation is clearly stronger, code as blended or indeterminate. Blended cases are logged separately and excluded from the main HOPE versus EMPOWERMENT distribution.</w:t>
       </w:r>
     </w:p>
     <w:p>

</xml_diff>

<commit_message>
Remove caption 30-word minimum to widen eligible post pool
</commit_message>
<xml_diff>
--- a/thesis/Thesis_Proposal_Instagram_MH_v11.docx
+++ b/thesis/Thesis_Proposal_Instagram_MH_v11.docx
@@ -2121,7 +2121,7 @@
           <w:szCs w:val="22"/>
           <w:rtl w:val="0"/>
         </w:rPr>
-        <w:t>This study is limited to a corpus of a maximum of 30 English-language Instagram captions drawn from approximately five to six publicly accessible mental health advocacy pages. Eligible posts are those published from September 2024 through December 2025. Preference is given to 2025 posts. Posts from September to December 2024 are included only when a page does not yield enough eligible 2025 captions. Each page contributes between five and eight eligible posts so that the limited pool of suitable English-language advocacy accounts can still support a full corpus. Each caption must contain a minimum of 30 English words. Posts must also show at least 100 likes and 20 visible comments. For each post, two eligible top-level comments are selected by maximum variation on response type when both types are present among eligible comments. Analysis is restricted to linguistic features: lexical choices, modality, pronoun use, directive structures, and discourse function. No causal or predictive relationship between caption type and comment response type is asserted.</w:t>
+        <w:t>This study is limited to a corpus of a maximum of 30 English-language Instagram captions drawn from approximately five to six publicly accessible mental health advocacy pages. Eligible posts are those published from September 2024 through December 2025. Preference is given to 2025 posts. Posts from September to December 2024 are included only when a page does not yield enough eligible 2025 captions. Each page contributes between five and eight eligible posts so that the limited pool of suitable English-language advocacy accounts can still support a full corpus. Posts must show at least 100 likes and 20 visible comments. Captions must be fully visible without platform truncation. For each post, two eligible top-level comments are selected by maximum variation on response type when both types are present among eligible comments. Analysis is restricted to linguistic features: lexical choices, modality, pronoun use, directive structures, and discourse function. No causal or predictive relationship between caption type and comment response type is asserted.</w:t>
       </w:r>
       <w:r>
         <w:rPr>
@@ -2285,12 +2285,12 @@
       </w:pPr>
       <w:r>
         <w:rPr>
-          <w:rFonts w:ascii="Georgia" w:cs="Georgia" w:eastAsia="Georgia" w:hAnsi="Georgia"/>
-          <w:sz w:val="22"/>
-          <w:szCs w:val="22"/>
-          <w:rtl w:val="0"/>
-        </w:rPr>
-        <w:t xml:space="preserve">English-language texts are selected exclusively to maintain linguistic consistency and to align with the researcher’s proficiency and program focus. The 30-word minimum per caption is set to ensure that each text contains sufficient lexical material for function-driven PDA coding; shorter captions risk being too sparse for reliable category assignment. Posts are sourced only from accounts whose primary editorial purpose is mental health advocacy; accounts that post mental health content incidentally within broader fitness, lifestyle, or general wellness feeds are excluded to preserve thematic coherence in the corpus. The analytical categories are bounded to two caption types — hope construction and empowerment language — and two comment types — supportive lexicon and personal narrative framing — reflecting the study’s focused scope. Psychological states, therapeutic outcomes, and behavioral effects are explicitly outside the scope of this inquiry; the study remains strictly within linguistic and discursive boundaries.</w:t>
+          <w:rFonts w:ascii="Times New Roman" w:cs="Georgia" w:eastAsia="Georgia" w:hAnsi="Times New Roman"/>
+          <w:sz w:val="22"/>
+          <w:szCs w:val="22"/>
+          <w:rtl w:val="0"/>
+        </w:rPr>
+        <w:t>English-language texts are selected exclusively to maintain linguistic consistency and to align with the researcher's proficiency and program focus. Posts are sourced only from accounts whose primary editorial purpose is mental health advocacy. Accounts that post mental health content incidentally within broader fitness, lifestyle, or general wellness feeds are excluded to preserve thematic coherence in the corpus. The analytical categories are bounded to two caption types, hope construction and empowerment language, and two comment types, supportive lexicon and personal narrative framing, reflecting the study's focused scope. Psychological states, therapeutic outcomes, and behavioral effects are explicitly outside the scope of this inquiry. The study remains strictly within linguistic and discursive boundaries.</w:t>
       </w:r>
       <w:r>
         <w:rPr>
@@ -2903,7 +2903,7 @@
           <w:szCs w:val="22"/>
           <w:rtl w:val="0"/>
         </w:rPr>
-        <w:t>1. Corpus Screening. Candidate public mental health advocacy pages are identified through Instagram search, relevant hashtags (for example #mentalhealthawareness, #mentalhealthadvocacy, #mentalhealthmatters), and related account suggestions. Eligible pages must meet all of the following criteria: (a) the account is publicly accessible, (b) the biography or page description clearly identifies mental health advocacy as the primary purpose, (c) the majority of posts address mental health awareness, coping, recovery, or peer support rather than general wellness, fitness, or lifestyle content, (d) the account is not primarily commercial, and (e) content is in English. Pages that only occasionally post mental health content within broader lifestyle or fitness feeds are excluded. Approximately five to six pages are retained. A screening log records pages considered, pages retained, and pages dropped. Within each retained page, posts are screened in chronological order from the top of the feed. Eligible posts are those published from September 2024 through December 2025 that meet the post criteria: English language, caption of at least 30 words, content that clearly addresses mental health awareness, support, coping, recovery, or advocacy, fully visible caption text, and engagement of at least 100 likes and 20 visible comments. Preference is given to 2025 posts. Posts from September to December 2024 are taken only when a page does not yield enough eligible 2025 captions. Each page contributes between five and eight eligible posts. Screening proceeds page by page until the corpus ceiling of 30 captions is reached or the candidate list is exhausted. Preference is given to posts that appear under relevant mental health hashtags, but hashtag use is not a hard requirement.</w:t>
+        <w:t>1. Corpus Screening. Candidate public mental health advocacy pages are identified through Instagram search, relevant hashtags (for example #mentalhealthawareness, #mentalhealthadvocacy, #mentalhealthmatters), and related account suggestions. Eligible pages must meet all of the following criteria: (a) the account is publicly accessible, (b) the biography or page description clearly identifies mental health advocacy as the primary purpose, (c) the majority of posts address mental health awareness, coping, recovery, or peer support rather than general wellness, fitness, or lifestyle content, (d) the account is not primarily commercial, and (e) content is in English. Pages that only occasionally post mental health content within broader lifestyle or fitness feeds are excluded. Approximately five to six pages are retained. A screening log records pages considered, pages retained, and pages dropped. Within each retained page, posts are screened in chronological order from the top of the feed. Eligible posts are those published from September 2024 through December 2025 that meet the post criteria: English language, content that clearly addresses mental health awareness, support, coping, recovery, or advocacy, fully visible caption text, and engagement of at least 100 likes and 20 visible comments. Preference is given to 2025 posts. Posts from September to December 2024 are taken only when a page does not yield enough eligible 2025 captions. Each page contributes between five and eight eligible posts. Screening proceeds page by page until the corpus ceiling of 30 captions is reached or the candidate list is exhausted. Preference is given to posts that appear under relevant mental health hashtags, but hashtag use is not a hard requirement.</w:t>
       </w:r>
       <w:r>
         <w:rPr>
@@ -3142,7 +3142,7 @@
           <w:szCs w:val="22"/>
           <w:rtl w:val="0"/>
         </w:rPr>
-        <w:t>The corpus consists of a maximum of 30 Instagram captions sourced from approximately five to six publicly accessible English-language mental health advocacy pages. Eligible posts are those published from September 2024 through December 2025. Preference is given to 2025 posts. Posts from September to December 2024 are included only when a page does not supply enough eligible 2025 captions to meet the per-page range. No cross-year comparison is performed. Corpus construction follows a stratified purposive sampling strategy (Patton, 2002). Stratification is applied by account. Each qualifying page contributes between five and eight eligible posts so that the limited pool of suitable English-language advocacy accounts can still support a full corpus and so that a range of advocacy voices is represented. Within each page, posts are purposively selected against these criteria: (1) published from September 2024 through December 2025, with preference for 2025, (2) caption contains a minimum of 30 English words, (3) content clearly addresses mental health awareness, support, coping, recovery, or advocacy, (4) caption is fully visible without platform truncation, and (5) the post shows at least 100 likes and 20 visible comments. For each retained post, two eligible top-level comments are selected by maximum variation on response type when both supportive-lexicon and personal-narrative orientations are present among eligible comments. Eligibility requires English language and sufficient continuous text for linguistic analysis. Nested replies are excluded. Total visible comment count is logged per post. All data are anonymized, stored securely, and used strictly for qualitative discourse analysis.</w:t>
+        <w:t>The corpus consists of a maximum of 30 Instagram captions sourced from approximately five to six publicly accessible English-language mental health advocacy pages. Eligible posts are those published from September 2024 through December 2025. Preference is given to 2025 posts. Posts from September to December 2024 are included only when a page does not supply enough eligible 2025 captions to meet the per-page range. No cross-year comparison is performed. Corpus construction follows a stratified purposive sampling strategy (Patton, 2002). Stratification is applied by account. Each qualifying page contributes between five and eight eligible posts so that the limited pool of suitable English-language advocacy accounts can still support a full corpus and so that a range of advocacy voices is represented. Within each page, posts are purposively selected against these criteria: (1) published from September 2024 through December 2025, with preference for 2025, (2) content clearly addresses mental health awareness, support, coping, recovery, or advocacy, (3) caption is fully visible without platform truncation, and (4) the post shows at least 100 likes and 20 visible comments. For each retained post, two eligible top-level comments are selected by maximum variation on response type when both supportive-lexicon and personal-narrative orientations are present among eligible comments. Eligibility requires English language and sufficient continuous text for linguistic analysis. Nested replies are excluded. Total visible comment count is logged per post. All data are anonymized, stored securely, and used strictly for qualitative discourse analysis.</w:t>
       </w:r>
       <w:r>
         <w:rPr>

</xml_diff>

<commit_message>
Simplify comment sampling wording: plain language, no maximum-variation jargon
</commit_message>
<xml_diff>
--- a/thesis/Thesis_Proposal_Instagram_MH_v11.docx
+++ b/thesis/Thesis_Proposal_Instagram_MH_v11.docx
@@ -1786,7 +1786,7 @@
           <w:szCs w:val="22"/>
           <w:rtl w:val="0"/>
         </w:rPr>
-        <w:t>The IPO structure organizes the three phases of analysis. In the Input phase, a corpus of a maximum of 30 publicly accessible English-language captions is assembled from about five to six Instagram mental health advocacy pages. Eligible posts are drawn from September 2024 through December 2025, with preference for 2025. Each page contributes between five and eight eligible posts. Two eligible top-level comments are selected per post by maximum variation on response type. In the Process phase, Phase 1 applies the two-stage Identify-and-Sort procedure under PDA to assign each caption a dominant orientation (HOPE, EMPOWERMENT, or blended) and to tally illustrative linguistic signals. Phase 2 applies the adapted Chang (2009) typology to the selected comments to identify and describe dominant linguistic features in public responses. Phase 3 synthesizes findings from both phases to describe patterns at the intersection of caption production and comment response. In the Output phase, the study produces three linked descriptive accounts: the dominant lexical and grammatical strategies in captions, the characteristic linguistic features of comment responses, and the collective discursive construction of positive mental health meaning that emerges when both levels are considered together. No causal inference is drawn between caption language and comment type. The analysis remains strictly descriptive throughout.</w:t>
+        <w:t>The IPO structure organizes the three phases of analysis. In the Input phase, a corpus of a maximum of 30 publicly accessible English-language captions is assembled from about five to six Instagram mental health advocacy pages. Eligible posts are drawn from September 2024 through December 2025, with preference for 2025. Each page contributes between five and eight eligible posts. Two eligible comments written directly under the post are selected for each caption. When both kinds of response appear, one that offers encouragement or validation without a personal story and one that shares a personal experience are taken. In the Process phase, Phase 1 applies the two-stage Identify-and-Sort procedure under PDA to assign each caption a dominant orientation (HOPE, EMPOWERMENT, or blended) and to tally illustrative linguistic signals. Phase 2 applies the adapted Chang (2009) typology to the selected comments to identify and describe dominant linguistic features in public responses. Phase 3 synthesizes findings from both phases to describe patterns at the intersection of caption production and comment response. In the Output phase, the study produces three linked descriptive accounts: the dominant lexical and grammatical strategies in captions, the characteristic linguistic features of comment responses, and the collective discursive construction of positive mental health meaning that emerges when both levels are considered together. No causal inference is drawn between caption language and comment type. The analysis remains strictly descriptive throughout.</w:t>
       </w:r>
       <w:r>
         <w:rPr>
@@ -2121,7 +2121,7 @@
           <w:szCs w:val="22"/>
           <w:rtl w:val="0"/>
         </w:rPr>
-        <w:t>This study is limited to a corpus of a maximum of 30 English-language Instagram captions drawn from approximately five to six publicly accessible mental health advocacy pages. Eligible posts are those published from September 2024 through December 2025. Preference is given to 2025 posts. Posts from September to December 2024 are included only when a page does not yield enough eligible 2025 captions. Each page contributes between five and eight eligible posts so that the limited pool of suitable English-language advocacy accounts can still support a full corpus. Posts must show at least 100 likes and 20 visible comments. Captions must be fully visible without platform truncation. For each post, two eligible top-level comments are selected by maximum variation on response type when both types are present among eligible comments. Analysis is restricted to linguistic features: lexical choices, modality, pronoun use, directive structures, and discourse function. No causal or predictive relationship between caption type and comment response type is asserted.</w:t>
+        <w:t>This study is limited to a corpus of a maximum of 30 English-language Instagram captions drawn from approximately five to six publicly accessible mental health advocacy pages. Eligible posts are those published from September 2024 through December 2025. Preference is given to 2025 posts. Posts from September to December 2024 are included only when a page does not yield enough eligible 2025 captions. Each page contributes between five and eight eligible posts so that the limited pool of suitable English-language advocacy accounts can still support a full corpus. Posts must show at least 100 likes and 20 visible comments. Captions must be fully visible without platform truncation. For each post, two eligible comments written directly under the caption are selected. When both kinds of response appear among those comments, one that offers encouragement or validation without a personal story and one that shares a personal experience are taken. When only one kind appears, the two clearest eligible comments of that kind are taken. Analysis is restricted to linguistic features: lexical choices, modality, pronoun use, directive structures, and discourse function. No causal or predictive relationship between caption type and comment response type is asserted.</w:t>
       </w:r>
       <w:r>
         <w:rPr>
@@ -2189,7 +2189,7 @@
           <w:szCs w:val="22"/>
           <w:rtl w:val="0"/>
         </w:rPr>
-        <w:t>The findings of this study reflect patterns within the specific 30-caption corpus and cannot be generalized to all Instagram mental health content, other social media platforms, or other languages. A strict text-only constraint is observed: visual and multimodal elements, including images, hashtags, and emoji, are excluded to maintain analytical focus on linguistic features. The corpus is drawn from a small number of English-language advocacy pages because many local pages use other languages. Comment sampling is purposive and capped at two eligible top-level comments per post. Nested replies are excluded. The sample therefore does not represent the full distribution of responses on high-engagement posts. The engagement-threshold criterion of at least 100 likes and 20 comments further restricts the corpus to high-engagement content and is not representative of lower-visibility mental health discourse. The publication window privileges 2025 posts. Late 2024 posts are used only to fill gaps, so the corpus is skewed toward more recent discourse by design.</w:t>
+        <w:t>The findings of this study reflect patterns within the specific 30-caption corpus and cannot be generalized to all Instagram mental health content, other social media platforms, or other languages. A strict text-only constraint is observed: visual and multimodal elements, including images, hashtags, and emoji, are excluded to maintain analytical focus on linguistic features. The corpus is drawn from a small number of English-language advocacy pages because many local pages use other languages. Comment sampling is purposive and capped at two eligible comments per post. Only comments written directly under the post are included. Nested replies are excluded. The sample therefore does not represent the full distribution of responses on high-engagement posts. The engagement-threshold criterion of at least 100 likes and 20 comments further restricts the corpus to high-engagement content and is not representative of lower-visibility mental health discourse. The publication window privileges 2025 posts. Late 2024 posts are used only to fill gaps, so the corpus is skewed toward more recent discourse by design.</w:t>
       </w:r>
       <w:r>
         <w:rPr>
@@ -2599,7 +2599,7 @@
           <w:szCs w:val="22"/>
           <w:rtl w:val="0"/>
         </w:rPr>
-        <w:t>Eligible Top-Level Comment. A comment written directly under the post (not a nested reply to another comment) that meets the study's eligibility filter: English language, sufficient continuous text for linguistic analysis (at least ten words or one analysable clause), and not limited to pure emoji, single-word reactions, tags, or links. From the eligible set, two comments per post are selected by maximum variation on response type when both types are present.</w:t>
+        <w:t>Eligible Comment. A comment written directly under the post, not a reply to another comment, that meets the study's eligibility filter: English language, enough continuous text for linguistic analysis (at least ten words or one full clause), and not limited to pure emoji, single-word reactions, tags, or links. For each post, two eligible comments are selected. When both kinds of response appear, one that offers encouragement or validation without a personal story and one that shares a personal experience related to the caption are taken. When only one kind appears, the two clearest eligible comments of that kind are taken.</w:t>
       </w:r>
       <w:r>
         <w:rPr>
@@ -3033,7 +3033,7 @@
           <w:szCs w:val="22"/>
           <w:rtl w:val="0"/>
         </w:rPr>
-        <w:t>4. Comment Extraction and Coding. For each retained post, top-level comments in the public chronological display are screened for eligibility. A comment is eligible only if it is written in English, contains sufficient continuous text for linguistic analysis (at least ten words or one analysable clause), and is not limited to pure emoji, single-word reactions, tags, or links. Nested replies to other comments are excluded. From the eligible set, two comments are selected by maximum variation on response type: one that leans toward supportive lexicon (encouragement, validation, or empathy without personal disclosure) and one that leans toward personal narrative framing (first-person experience related to the caption theme), when both kinds are present. When only one kind appears, the two clearest eligible examples of that kind are taken. When fewer than two eligible comments exist, the post is excluded from the final corpus or recorded as a partial case under a rule fixed before coding begins. Total visible comment count is logged per post. Each selected comment is then coded as SUPPORTIVE LEXICON or PERSONAL NARRATIVE by dominant communicative purpose using Appendix B. Unclassifiable rates are reported. If they exceed 20 percent of the sample, coding markers are refined with adviser consultation. Items that still cannot be assigned a dominant function are placed in a third descriptive category (blended/indeterminate) and reported separately.</w:t>
+        <w:t>4. Comment Extraction and Coding. For each retained post, comments written directly under the caption are screened for eligibility. A comment is eligible only if it is written in English, contains enough continuous text for linguistic analysis (at least ten words or one full clause), and is not limited to pure emoji, single-word reactions, tags, or links. Replies nested under other comments are excluded. From the eligible comments, two are selected. When both kinds of response appear, one that offers encouragement, validation, or empathy without sharing a personal story and one that shares a first-person experience related to the caption are taken. When only one kind appears, the two clearest eligible comments of that kind are taken. When fewer than two eligible comments exist, the post is excluded from the final corpus or recorded as a partial case under a rule fixed before coding begins. Total visible comment count is logged per post. Each selected comment is then coded as SUPPORTIVE LEXICON or PERSONAL NARRATIVE by dominant communicative purpose using Appendix B. Unclassifiable rates are reported. If they exceed 20 percent of the sample, coding markers are refined with adviser consultation. Items that still cannot be assigned a dominant function are placed in a third descriptive category (blended/indeterminate) and reported separately.</w:t>
       </w:r>
       <w:r>
         <w:rPr>
@@ -3142,7 +3142,7 @@
           <w:szCs w:val="22"/>
           <w:rtl w:val="0"/>
         </w:rPr>
-        <w:t>The corpus consists of a maximum of 30 Instagram captions sourced from approximately five to six publicly accessible English-language mental health advocacy pages. Eligible posts are those published from September 2024 through December 2025. Preference is given to 2025 posts. Posts from September to December 2024 are included only when a page does not supply enough eligible 2025 captions to meet the per-page range. No cross-year comparison is performed. Corpus construction follows a stratified purposive sampling strategy (Patton, 2002). Stratification is applied by account. Each qualifying page contributes between five and eight eligible posts so that the limited pool of suitable English-language advocacy accounts can still support a full corpus and so that a range of advocacy voices is represented. Within each page, posts are purposively selected against these criteria: (1) published from September 2024 through December 2025, with preference for 2025, (2) content clearly addresses mental health awareness, support, coping, recovery, or advocacy, (3) caption is fully visible without platform truncation, and (4) the post shows at least 100 likes and 20 visible comments. For each retained post, two eligible top-level comments are selected by maximum variation on response type when both supportive-lexicon and personal-narrative orientations are present among eligible comments. Eligibility requires English language and sufficient continuous text for linguistic analysis. Nested replies are excluded. Total visible comment count is logged per post. All data are anonymized, stored securely, and used strictly for qualitative discourse analysis.</w:t>
+        <w:t>The corpus consists of a maximum of 30 Instagram captions sourced from approximately five to six publicly accessible English-language mental health advocacy pages. Eligible posts are those published from September 2024 through December 2025. Preference is given to 2025 posts. Posts from September to December 2024 are included only when a page does not supply enough eligible 2025 captions to meet the per-page range. No cross-year comparison is performed. Corpus construction follows a stratified purposive sampling strategy (Patton, 2002). Stratification is applied by account. Each qualifying page contributes between five and eight eligible posts so that the limited pool of suitable English-language advocacy accounts can still support a full corpus and so that a range of advocacy voices is represented. Within each page, posts are purposively selected against these criteria: (1) published from September 2024 through December 2025, with preference for 2025, (2) content clearly addresses mental health awareness, support, coping, recovery, or advocacy, (3) caption is fully visible without platform truncation, and (4) the post shows at least 100 likes and 20 visible comments. For each retained post, two eligible comments written directly under the caption are selected. When both kinds of response appear among eligible comments, one that offers encouragement or validation without a personal story and one that shares a personal experience are taken. When only one kind appears, the two clearest eligible comments of that kind are taken. Eligibility requires English language and enough continuous text for linguistic analysis. Nested replies are excluded. Total visible comment count is logged per post. All data are anonymized, stored securely, and used strictly for qualitative discourse analysis.</w:t>
       </w:r>
       <w:r>
         <w:rPr>

</xml_diff>

<commit_message>
State comment eligibility criteria next to selection wording in Scope and Corpus
</commit_message>
<xml_diff>
--- a/thesis/Thesis_Proposal_Instagram_MH_v11.docx
+++ b/thesis/Thesis_Proposal_Instagram_MH_v11.docx
@@ -1786,7 +1786,7 @@
           <w:szCs w:val="22"/>
           <w:rtl w:val="0"/>
         </w:rPr>
-        <w:t>The IPO structure organizes the three phases of analysis. In the Input phase, a corpus of a maximum of 30 publicly accessible English-language captions is assembled from about five to six Instagram mental health advocacy pages. Eligible posts are drawn from September 2024 through December 2025, with preference for 2025. Each page contributes between five and eight eligible posts. Two eligible comments written directly under the post are selected for each caption. When both kinds of response appear, one that offers encouragement or validation without a personal story and one that shares a personal experience are taken. In the Process phase, Phase 1 applies the two-stage Identify-and-Sort procedure under PDA to assign each caption a dominant orientation (HOPE, EMPOWERMENT, or blended) and to tally illustrative linguistic signals. Phase 2 applies the adapted Chang (2009) typology to the selected comments to identify and describe dominant linguistic features in public responses. Phase 3 synthesizes findings from both phases to describe patterns at the intersection of caption production and comment response. In the Output phase, the study produces three linked descriptive accounts: the dominant lexical and grammatical strategies in captions, the characteristic linguistic features of comment responses, and the collective discursive construction of positive mental health meaning that emerges when both levels are considered together. No causal inference is drawn between caption language and comment type. The analysis remains strictly descriptive throughout.</w:t>
+        <w:t>The IPO structure organizes the three phases of analysis. In the Input phase, a corpus of a maximum of 30 publicly accessible English-language captions is assembled from about five to six Instagram mental health advocacy pages. Eligible posts are drawn from September 2024 through December 2025, with preference for 2025. Each page contributes between five and eight eligible posts. Two comments written directly under each caption are selected. Comments must be in English, long enough for analysis, and not pure emoji or single-word reactions. When both kinds of response appear, one that offers encouragement or validation without a personal story and one that shares a personal experience are taken. In the Process phase, Phase 1 applies the two-stage Identify-and-Sort procedure under PDA to assign each caption a dominant orientation (HOPE, EMPOWERMENT, or blended) and to tally illustrative linguistic signals. Phase 2 applies the adapted Chang (2009) typology to the selected comments to identify and describe dominant linguistic features in public responses. Phase 3 synthesizes findings from both phases to describe patterns at the intersection of caption production and comment response. In the Output phase, the study produces three linked descriptive accounts: the dominant lexical and grammatical strategies in captions, the characteristic linguistic features of comment responses, and the collective discursive construction of positive mental health meaning that emerges when both levels are considered together. No causal inference is drawn between caption language and comment type. The analysis remains strictly descriptive throughout.</w:t>
       </w:r>
       <w:r>
         <w:rPr>
@@ -2121,7 +2121,7 @@
           <w:szCs w:val="22"/>
           <w:rtl w:val="0"/>
         </w:rPr>
-        <w:t>This study is limited to a corpus of a maximum of 30 English-language Instagram captions drawn from approximately five to six publicly accessible mental health advocacy pages. Eligible posts are those published from September 2024 through December 2025. Preference is given to 2025 posts. Posts from September to December 2024 are included only when a page does not yield enough eligible 2025 captions. Each page contributes between five and eight eligible posts so that the limited pool of suitable English-language advocacy accounts can still support a full corpus. Posts must show at least 100 likes and 20 visible comments. Captions must be fully visible without platform truncation. For each post, two eligible comments written directly under the caption are selected. When both kinds of response appear among those comments, one that offers encouragement or validation without a personal story and one that shares a personal experience are taken. When only one kind appears, the two clearest eligible comments of that kind are taken. Analysis is restricted to linguistic features: lexical choices, modality, pronoun use, directive structures, and discourse function. No causal or predictive relationship between caption type and comment response type is asserted.</w:t>
+        <w:t>This study is limited to a corpus of a maximum of 30 English-language Instagram captions drawn from approximately five to six publicly accessible mental health advocacy pages. Eligible posts are those published from September 2024 through December 2025. Preference is given to 2025 posts. Posts from September to December 2024 are included only when a page does not yield enough eligible 2025 captions. Each page contributes between five and eight eligible posts so that the limited pool of suitable English-language advocacy accounts can still support a full corpus. Posts must show at least 100 likes and 20 visible comments. Captions must be fully visible without platform truncation. For each post, two comments written directly under the caption are selected. A comment counts only if it is in English, has enough continuous text for analysis (at least ten words or one full clause), and is not limited to pure emoji, single-word reactions, tags, or links. When both kinds of response appear among those comments, one that offers encouragement or validation without a personal story and one that shares a personal experience are taken. When only one kind appears, the two clearest comments that meet the criteria are taken. Analysis is restricted to linguistic features: lexical choices, modality, pronoun use, directive structures, and discourse function. No causal or predictive relationship between caption type and comment response type is asserted.</w:t>
       </w:r>
       <w:r>
         <w:rPr>
@@ -2189,7 +2189,7 @@
           <w:szCs w:val="22"/>
           <w:rtl w:val="0"/>
         </w:rPr>
-        <w:t>The findings of this study reflect patterns within the specific 30-caption corpus and cannot be generalized to all Instagram mental health content, other social media platforms, or other languages. A strict text-only constraint is observed: visual and multimodal elements, including images, hashtags, and emoji, are excluded to maintain analytical focus on linguistic features. The corpus is drawn from a small number of English-language advocacy pages because many local pages use other languages. Comment sampling is purposive and capped at two eligible comments per post. Only comments written directly under the post are included. Nested replies are excluded. The sample therefore does not represent the full distribution of responses on high-engagement posts. The engagement-threshold criterion of at least 100 likes and 20 comments further restricts the corpus to high-engagement content and is not representative of lower-visibility mental health discourse. The publication window privileges 2025 posts. Late 2024 posts are used only to fill gaps, so the corpus is skewed toward more recent discourse by design.</w:t>
+        <w:t>The findings of this study reflect patterns within the specific 30-caption corpus and cannot be generalized to all Instagram mental health content, other social media platforms, or other languages. A strict text-only constraint is observed: visual and multimodal elements, including images, hashtags, and emoji, are excluded to maintain analytical focus on linguistic features. The corpus is drawn from a small number of English-language advocacy pages because many local pages use other languages. Comment sampling is purposive and capped at two comments per post. Only comments written directly under the post are included. Nested replies are excluded. Comments must be in English, long enough for analysis, and not limited to pure emoji, single-word reactions, tags, or links. The sample therefore does not represent the full distribution of responses on high-engagement posts. The engagement-threshold criterion of at least 100 likes and 20 comments further restricts the corpus to high-engagement content and is not representative of lower-visibility mental health discourse. The publication window privileges 2025 posts. Late 2024 posts are used only to fill gaps, so the corpus is skewed toward more recent discourse by design.</w:t>
       </w:r>
       <w:r>
         <w:rPr>
@@ -3142,7 +3142,7 @@
           <w:szCs w:val="22"/>
           <w:rtl w:val="0"/>
         </w:rPr>
-        <w:t>The corpus consists of a maximum of 30 Instagram captions sourced from approximately five to six publicly accessible English-language mental health advocacy pages. Eligible posts are those published from September 2024 through December 2025. Preference is given to 2025 posts. Posts from September to December 2024 are included only when a page does not supply enough eligible 2025 captions to meet the per-page range. No cross-year comparison is performed. Corpus construction follows a stratified purposive sampling strategy (Patton, 2002). Stratification is applied by account. Each qualifying page contributes between five and eight eligible posts so that the limited pool of suitable English-language advocacy accounts can still support a full corpus and so that a range of advocacy voices is represented. Within each page, posts are purposively selected against these criteria: (1) published from September 2024 through December 2025, with preference for 2025, (2) content clearly addresses mental health awareness, support, coping, recovery, or advocacy, (3) caption is fully visible without platform truncation, and (4) the post shows at least 100 likes and 20 visible comments. For each retained post, two eligible comments written directly under the caption are selected. When both kinds of response appear among eligible comments, one that offers encouragement or validation without a personal story and one that shares a personal experience are taken. When only one kind appears, the two clearest eligible comments of that kind are taken. Eligibility requires English language and enough continuous text for linguistic analysis. Nested replies are excluded. Total visible comment count is logged per post. All data are anonymized, stored securely, and used strictly for qualitative discourse analysis.</w:t>
+        <w:t>The corpus consists of a maximum of 30 Instagram captions sourced from approximately five to six publicly accessible English-language mental health advocacy pages. Eligible posts are those published from September 2024 through December 2025. Preference is given to 2025 posts. Posts from September to December 2024 are included only when a page does not supply enough eligible 2025 captions to meet the per-page range. No cross-year comparison is performed. Corpus construction follows a stratified purposive sampling strategy (Patton, 2002). Stratification is applied by account. Each qualifying page contributes between five and eight eligible posts so that the limited pool of suitable English-language advocacy accounts can still support a full corpus and so that a range of advocacy voices is represented. Within each page, posts are purposively selected against these criteria: (1) published from September 2024 through December 2025, with preference for 2025, (2) content clearly addresses mental health awareness, support, coping, recovery, or advocacy, (3) caption is fully visible without platform truncation, and (4) the post shows at least 100 likes and 20 visible comments. For each retained post, two comments written directly under the caption are selected. A comment counts only if it is in English, has enough continuous text for analysis (at least ten words or one full clause), and is not limited to pure emoji, single-word reactions, tags, or links. Nested replies are excluded. When both kinds of response appear among those comments, one that offers encouragement or validation without a personal story and one that shares a personal experience are taken. When only one kind appears, the two clearest comments that meet the criteria are taken. Total visible comment count is logged per post. All data are anonymized, stored securely, and used strictly for qualitative discourse analysis.</w:t>
       </w:r>
       <w:r>
         <w:rPr>

</xml_diff>